<commit_message>
Scope water filter TOR to 1 machine, 1 cleaning
Co-Authored-By: Claude Sonnet 5.5 <noreply@anthropic.com>
Claude-Session: https://claude.ai/code/session_018sSEssnHssGnWMVn9wDjgj
</commit_message>
<xml_diff>
--- a/TOR_ล้างเครื่องกรองน้ำ_ปีงบ70.docx
+++ b/TOR_ล้างเครื่องกรองน้ำ_ปีงบ70.docx
@@ -104,7 +104,7 @@
         <w:pStyle w:val="FirstParagraph"/>
       </w:pPr>
       <w:r>
-        <w:t xml:space="preserve">ศูนย์แพทยศาสตรศึกษา มีเครื่องกรองน้ำดื่มสำหรับบริการผู้เรียน บุคลากร และผู้มาใช้อาคาร จำนวน …….. เครื่อง ตั้งอยู่ ณ …………………… เพื่อให้น้ำดื่มสะอาดปลอดภัยตามหลักสุขาภิบาล จำเป็นต้องล้างทำความสะอาดระบบกรองและฆ่าเชื้อตามรอบเวลา โดยผู้มีความรู้เฉพาะด้าน จึงจัดจ้างเหมาบริการจากผู้ประกอบการภายนอก</w:t>
+        <w:t xml:space="preserve">ศูนย์แพทยศาสตรศึกษา มีเครื่องกรองน้ำดื่มสำหรับบริการผู้เรียน บุคลากร และผู้มาใช้อาคาร จำนวน 1 เครื่อง ตั้งอยู่ ณ …………………… เพื่อให้น้ำดื่มสะอาดปลอดภัยตามหลักสุขาภิบาล จำเป็นต้องล้างทำความสะอาดระบบกรองและฆ่าเชื้อตามรอบเวลา โดยผู้มีความรู้เฉพาะด้าน จึงจัดจ้างเหมาบริการจากผู้ประกอบการภายนอก</w:t>
       </w:r>
     </w:p>
     <w:bookmarkEnd w:id="20"/>
@@ -271,7 +271,7 @@
         <w:t xml:space="preserve"> </w:t>
       </w:r>
       <w:r>
-        <w:t xml:space="preserve">มีผลงานล้างหรือบำรุงรักษาเครื่องกรองน้ำดื่ม ไม่น้อยกว่า …….. ผลงาน หรือประกอบกิจการด้านนี้มาไม่น้อยกว่า …….. ปี พร้อมแนบสำเนาสัญญา หนังสือรับรองผลงาน หรือใบส่งมอบงาน</w:t>
+        <w:t xml:space="preserve">มีผลงานล้างหรือบำรุงรักษาเครื่องกรองน้ำดื่ม อย่างน้อย 1 ผลงาน พร้อมแนบสำเนาสัญญา หนังสือรับรองผลงาน หรือใบส่งมอบงาน</w:t>
       </w:r>
     </w:p>
     <w:p>
@@ -295,7 +295,7 @@
         <w:t xml:space="preserve"> </w:t>
       </w:r>
       <w:r>
-        <w:t xml:space="preserve">มีช่างหรือเจ้าหน้าที่ปฏิบัติงานที่ผ่านการอบรมหรือมีประสบการณ์ด้านระบบกรองน้ำ อย่างน้อย …….. คน พร้อมแนบประวัติและหลักฐานการอบรม</w:t>
+        <w:t xml:space="preserve">มีช่างหรือเจ้าหน้าที่ปฏิบัติงานที่ผ่านการอบรมหรือมีประสบการณ์ด้านระบบกรองน้ำ อย่างน้อย 1 คน พร้อมแนบประวัติหรือหลักฐานการอบรม</w:t>
       </w:r>
     </w:p>
     <w:p>
@@ -361,7 +361,7 @@
           <w:bCs/>
           <w:b/>
         </w:rPr>
-        <w:t xml:space="preserve">ห้องปฏิบัติการตรวจน้ำ (ถ้ากำหนดให้ตรวจ):</w:t>
+        <w:t xml:space="preserve">ห้องปฏิบัติการตรวจน้ำ (เฉพาะกรณีกำหนดให้ตรวจคุณภาพน้ำ):</w:t>
       </w:r>
       <w:r>
         <w:t xml:space="preserve"> </w:t>
@@ -391,7 +391,7 @@
         <w:t xml:space="preserve"> </w:t>
       </w:r>
       <w:r>
-        <w:t xml:space="preserve">(ถ้ากำหนด) มีประกันภัยความรับผิดต่อบุคคลภายนอก วงเงินไม่น้อยกว่า …….. บาท</w:t>
+        <w:t xml:space="preserve">(ไม่บังคับ ใช้เมื่อเครื่องมีมูลค่าสูงหรือติดตั้งในพื้นที่เสี่ยง) มีประกันภัยความรับผิดต่อบุคคลภายนอก วงเงินไม่น้อยกว่า …….. บาท</w:t>
       </w:r>
     </w:p>
     <w:bookmarkEnd w:id="23"/>
@@ -428,15 +428,15 @@
         <w:pStyle w:val="FirstParagraph"/>
       </w:pPr>
       <w:r>
-        <w:t xml:space="preserve">5.1 ระยะเวลาจ้าง 12 เดือน นับจากวันที่ …….. ถึงวันที่ ……..</w:t>
-      </w:r>
-    </w:p>
-    <w:p>
-      <w:pPr>
-        <w:pStyle w:val="BodyText"/>
-      </w:pPr>
-      <w:r>
-        <w:t xml:space="preserve">5.2 ให้บริการจำนวน …….. ครั้ง ตามรอบเวลา (เช่น ทุก 3 เดือน หรือ 6 เดือน) ตามกำหนดการที่ตกลงกับศูนย์ฯ ล่วงหน้าไม่น้อยกว่า 7 วัน</w:t>
+        <w:t xml:space="preserve">5.1 ผู้รับจ้างต้องปฏิบัติงานให้แล้วเสร็จภายใน …….. วัน นับถัดจากวันลงนามในสัญญาหรือวันที่ได้รับใบสั่งจ้าง</w:t>
+      </w:r>
+    </w:p>
+    <w:p>
+      <w:pPr>
+        <w:pStyle w:val="BodyText"/>
+      </w:pPr>
+      <w:r>
+        <w:t xml:space="preserve">5.2 ให้บริการล้างจำนวน 1 เครื่อง 1 ครั้ง ภายในระยะเวลาจ้าง ตามกำหนดการที่ตกลงกับศูนย์ฯ ล่วงหน้าไม่น้อยกว่า 7 วัน</w:t>
       </w:r>
     </w:p>
     <w:p>
@@ -470,7 +470,7 @@
         <w:pStyle w:val="BodyText"/>
       </w:pPr>
       <w:r>
-        <w:t xml:space="preserve">6.2 ราคากลาง ……………… บาท (แนบรายละเอียดการคำนวณ เช่น ค่าบริการต่อเครื่องต่อครั้ง × จำนวนเครื่อง × จำนวนครั้ง + ค่าตรวจน้ำ)</w:t>
+        <w:t xml:space="preserve">6.2 ราคากลาง ……………… บาท (แนบรายละเอียดการคำนวณ เช่น ค่าบริการล้าง 1 เครื่อง 1 ครั้ง + ค่าตรวจน้ำ (ถ้ามี) + ไส้กรองที่ต้องเปลี่ยน (ถ้ามี))</w:t>
       </w:r>
     </w:p>
     <w:p>
@@ -554,15 +554,15 @@
         <w:pStyle w:val="BodyText"/>
       </w:pPr>
       <w:r>
-        <w:t xml:space="preserve">8.5 แผนการปฏิบัติงานและกำหนดการให้บริการตลอด 12 เดือน</w:t>
-      </w:r>
-    </w:p>
-    <w:p>
-      <w:pPr>
-        <w:pStyle w:val="BodyText"/>
-      </w:pPr>
-      <w:r>
-        <w:t xml:space="preserve">8.6 ใบเสนอราคาแสดงรายการ จำนวนเครื่อง จำนวนครั้ง ราคาต่อหน่วย และราคารวม</w:t>
+        <w:t xml:space="preserve">8.5 กำหนดวันที่เสนอให้เข้าปฏิบัติงาน</w:t>
+      </w:r>
+    </w:p>
+    <w:p>
+      <w:pPr>
+        <w:pStyle w:val="BodyText"/>
+      </w:pPr>
+      <w:r>
+        <w:t xml:space="preserve">8.6 ใบเสนอราคาแสดงรายการ ราคาล้าง 1 เครื่อง 1 ครั้ง และราคาไส้กรองหรืออะไหล่ (ถ้ามี) แยกรายการ</w:t>
       </w:r>
     </w:p>
     <w:bookmarkEnd w:id="29"/>
@@ -580,7 +580,7 @@
         <w:pStyle w:val="FirstParagraph"/>
       </w:pPr>
       <w:r>
-        <w:t xml:space="preserve">9.1 ผู้รับจ้างส่งมอบรายงานผลการปฏิบัติงานทุกครั้งที่ให้บริการ ประกอบด้วย วันเวลา รายการเครื่อง สภาพก่อนและหลังล้าง ภาพถ่าย รายการวัสดุที่เปลี่ยน ผลตรวจน้ำ (ถ้ามี) และลายมือชื่อผู้ปฏิบัติงานกับผู้ควบคุมของศูนย์ฯ</w:t>
+        <w:t xml:space="preserve">9.1 ผู้รับจ้างส่งมอบรายงานผลการปฏิบัติงานเมื่อให้บริการเสร็จ ประกอบด้วย วันเวลา รายการเครื่อง สภาพก่อนและหลังล้าง ภาพถ่าย รายการวัสดุที่เปลี่ยน ผลตรวจน้ำ (ถ้ามี) และลายมือชื่อผู้ปฏิบัติงานกับผู้ควบคุมของศูนย์ฯ</w:t>
       </w:r>
     </w:p>
     <w:p>
@@ -614,15 +614,15 @@
         <w:pStyle w:val="FirstParagraph"/>
       </w:pPr>
       <w:r>
-        <w:t xml:space="preserve">10.1 ชำระเงินเป็นงวดตามจำนวนครั้งที่ให้บริการ (ครั้งละ …….. บาท) หรือชำระงวดเดียวเมื่อสิ้นสุดสัญญา ตามที่กำหนดในสัญญา</w:t>
-      </w:r>
-    </w:p>
-    <w:p>
-      <w:pPr>
-        <w:pStyle w:val="BodyText"/>
-      </w:pPr>
-      <w:r>
-        <w:t xml:space="preserve">10.2 ชำระภายใน 30 วัน นับถัดจากวันที่ตรวจรับงานถูกต้องครบถ้วน และได้รับใบแจ้งหนี้หรือใบกำกับภาษี</w:t>
+        <w:t xml:space="preserve">10.1 ชำระเงินเต็มจำนวนงวดเดียว หลังตรวจรับงานถูกต้องครบถ้วนแล้ว</w:t>
+      </w:r>
+    </w:p>
+    <w:p>
+      <w:pPr>
+        <w:pStyle w:val="BodyText"/>
+      </w:pPr>
+      <w:r>
+        <w:t xml:space="preserve">10.2 ชำระภายใน 30 วัน นับถัดจากวันที่ได้รับใบแจ้งหนี้หรือใบกำกับภาษีที่ถูกต้อง</w:t>
       </w:r>
     </w:p>
     <w:bookmarkEnd w:id="31"/>
@@ -716,7 +716,7 @@
         <w:pStyle w:val="BodyText"/>
       </w:pPr>
       <w:r>
-        <w:t xml:space="preserve">13.3 ศูนย์ฯ ขอสงวนสิทธิ์ปรับเพิ่มหรือลดจำนวนเครื่องและจำนวนครั้ง ตามความเหมาะสมและวงเงิน โดยคิดราคาตามอัตราต่อหน่วยที่เสนอไว้</w:t>
+        <w:t xml:space="preserve">13.3 ศูนย์ฯ ขอสงวนสิทธิ์ให้เปลี่ยนไส้กรองเฉพาะรายการที่จำเป็นและได้รับอนุมัติก่อนเท่านั้น โดยคิดราคาตามอัตราที่เสนอไว้</w:t>
       </w:r>
     </w:p>
     <w:bookmarkEnd w:id="34"/>
@@ -1108,114 +1108,6 @@
             </w:pPr>
             <w:r>
               <w:t xml:space="preserve">1</w:t>
-            </w:r>
-          </w:p>
-        </w:tc>
-        <w:tc>
-          <w:tcPr/>
-          <w:p>
-            <w:pPr>
-              <w:pStyle w:val="Compact"/>
-            </w:pPr>
-          </w:p>
-        </w:tc>
-        <w:tc>
-          <w:tcPr/>
-          <w:p>
-            <w:pPr>
-              <w:pStyle w:val="Compact"/>
-            </w:pPr>
-          </w:p>
-        </w:tc>
-        <w:tc>
-          <w:tcPr/>
-          <w:p>
-            <w:pPr>
-              <w:pStyle w:val="Compact"/>
-            </w:pPr>
-          </w:p>
-        </w:tc>
-        <w:tc>
-          <w:tcPr/>
-          <w:p>
-            <w:pPr>
-              <w:pStyle w:val="Compact"/>
-            </w:pPr>
-          </w:p>
-        </w:tc>
-        <w:tc>
-          <w:tcPr/>
-          <w:p>
-            <w:pPr>
-              <w:pStyle w:val="Compact"/>
-            </w:pPr>
-          </w:p>
-        </w:tc>
-      </w:tr>
-      <w:tr>
-        <w:tc>
-          <w:tcPr/>
-          <w:p>
-            <w:pPr>
-              <w:pStyle w:val="Compact"/>
-              <w:jc w:val="center"/>
-            </w:pPr>
-            <w:r>
-              <w:t xml:space="preserve">2</w:t>
-            </w:r>
-          </w:p>
-        </w:tc>
-        <w:tc>
-          <w:tcPr/>
-          <w:p>
-            <w:pPr>
-              <w:pStyle w:val="Compact"/>
-            </w:pPr>
-          </w:p>
-        </w:tc>
-        <w:tc>
-          <w:tcPr/>
-          <w:p>
-            <w:pPr>
-              <w:pStyle w:val="Compact"/>
-            </w:pPr>
-          </w:p>
-        </w:tc>
-        <w:tc>
-          <w:tcPr/>
-          <w:p>
-            <w:pPr>
-              <w:pStyle w:val="Compact"/>
-            </w:pPr>
-          </w:p>
-        </w:tc>
-        <w:tc>
-          <w:tcPr/>
-          <w:p>
-            <w:pPr>
-              <w:pStyle w:val="Compact"/>
-            </w:pPr>
-          </w:p>
-        </w:tc>
-        <w:tc>
-          <w:tcPr/>
-          <w:p>
-            <w:pPr>
-              <w:pStyle w:val="Compact"/>
-            </w:pPr>
-          </w:p>
-        </w:tc>
-      </w:tr>
-      <w:tr>
-        <w:tc>
-          <w:tcPr/>
-          <w:p>
-            <w:pPr>
-              <w:pStyle w:val="Compact"/>
-              <w:jc w:val="center"/>
-            </w:pPr>
-            <w:r>
-              <w:t xml:space="preserve">3</w:t>
             </w:r>
           </w:p>
         </w:tc>

</xml_diff>